<commit_message>
Update report.docx for lab14 (quarto build)
</commit_message>
<xml_diff>
--- a/labs/lab14/report.docx
+++ b/labs/lab14/report.docx
@@ -18,13 +18,64 @@
         <w:t xml:space="preserve">Расширенное программирование в shell</w:t>
       </w:r>
     </w:p>
-    <w:bookmarkStart w:id="9" w:name="цель-работы"/>
+    <w:p>
+      <w:pPr>
+        <w:pStyle w:val="Author"/>
+      </w:pPr>
+      <w:r>
+        <w:t xml:space="preserve">Савкин Дмитрий Вадимович</w:t>
+      </w:r>
+    </w:p>
+    <w:p>
+      <w:pPr>
+        <w:pStyle w:val="Date"/>
+      </w:pPr>
+      <w:r>
+        <w:t xml:space="preserve">2026-10-12</w:t>
+      </w:r>
+    </w:p>
+    <w:sdt>
+      <w:sdtPr>
+        <w:docPartObj>
+          <w:docPartGallery w:val="Table of Contents"/>
+          <w:docPartUnique/>
+        </w:docPartObj>
+      </w:sdtPr>
+      <w:sdtContent>
+        <w:p>
+          <w:pPr>
+            <w:pStyle w:val="TOCHeading"/>
+          </w:pPr>
+          <w:r>
+            <w:t xml:space="preserve">Содержание</w:t>
+          </w:r>
+        </w:p>
+        <w:p>
+          <w:r>
+            <w:fldChar w:fldCharType="begin" w:dirty="true"/>
+            <w:instrText xml:space="preserve">TOC \o "1-2" \h \z \u</w:instrText>
+            <w:fldChar w:fldCharType="separate"/>
+            <w:fldChar w:fldCharType="end"/>
+          </w:r>
+        </w:p>
+      </w:sdtContent>
+    </w:sdt>
+    <w:bookmarkStart w:id="15" w:name="введение"/>
     <w:p>
       <w:pPr>
         <w:pStyle w:val="Heading1"/>
       </w:pPr>
       <w:r>
-        <w:t xml:space="preserve">Цель работы</w:t>
+        <w:t xml:space="preserve">1. Введение</w:t>
+      </w:r>
+    </w:p>
+    <w:bookmarkStart w:id="9" w:name="актуальность"/>
+    <w:p>
+      <w:pPr>
+        <w:pStyle w:val="Heading2"/>
+      </w:pPr>
+      <w:r>
+        <w:t xml:space="preserve">1.1 Актуальность</w:t>
       </w:r>
     </w:p>
     <w:p>
@@ -32,17 +83,35 @@
         <w:pStyle w:val="FirstParagraph"/>
       </w:pPr>
       <w:r>
+        <w:t xml:space="preserve">Синхронизация процессов и работа со случайными данными — элементы, встречающиеся в более сложных системных сценариях автоматизации.</w:t>
+      </w:r>
+    </w:p>
+    <w:bookmarkEnd w:id="9"/>
+    <w:bookmarkStart w:id="10" w:name="цель-работы"/>
+    <w:p>
+      <w:pPr>
+        <w:pStyle w:val="Heading2"/>
+      </w:pPr>
+      <w:r>
+        <w:t xml:space="preserve">1.2 Цель работы</w:t>
+      </w:r>
+    </w:p>
+    <w:p>
+      <w:pPr>
+        <w:pStyle w:val="FirstParagraph"/>
+      </w:pPr>
+      <w:r>
         <w:t xml:space="preserve">Написание сложных командных файлов с логическими конструкциями и циклами.</w:t>
       </w:r>
     </w:p>
-    <w:bookmarkEnd w:id="9"/>
-    <w:bookmarkStart w:id="10" w:name="задание"/>
-    <w:p>
-      <w:pPr>
-        <w:pStyle w:val="Heading1"/>
-      </w:pPr>
-      <w:r>
-        <w:t xml:space="preserve">Задание</w:t>
+    <w:bookmarkEnd w:id="10"/>
+    <w:bookmarkStart w:id="11" w:name="задачи"/>
+    <w:p>
+      <w:pPr>
+        <w:pStyle w:val="Heading2"/>
+      </w:pPr>
+      <w:r>
+        <w:t xml:space="preserve">1.3 Задачи</w:t>
       </w:r>
     </w:p>
     <w:p>
@@ -108,14 +177,69 @@
         <w:t xml:space="preserve">.</w:t>
       </w:r>
     </w:p>
-    <w:bookmarkEnd w:id="10"/>
-    <w:bookmarkStart w:id="32" w:name="выполнение-лабораторной-работы"/>
+    <w:bookmarkEnd w:id="11"/>
+    <w:bookmarkStart w:id="12" w:name="объект-и-предмет-исследования"/>
+    <w:p>
+      <w:pPr>
+        <w:pStyle w:val="Heading2"/>
+      </w:pPr>
+      <w:r>
+        <w:t xml:space="preserve">1.4 Объект и предмет исследования</w:t>
+      </w:r>
+    </w:p>
+    <w:p>
+      <w:pPr>
+        <w:pStyle w:val="FirstParagraph"/>
+      </w:pPr>
+      <w:r>
+        <w:t xml:space="preserve">Объект — взаимодействующие процессы; предмет — синхронизация через файл-блокировку и генерация случайных данных.</w:t>
+      </w:r>
+    </w:p>
+    <w:bookmarkEnd w:id="12"/>
+    <w:bookmarkStart w:id="13" w:name="методы-исследования"/>
+    <w:p>
+      <w:pPr>
+        <w:pStyle w:val="Heading2"/>
+      </w:pPr>
+      <w:r>
+        <w:t xml:space="preserve">1.5 Методы исследования</w:t>
+      </w:r>
+    </w:p>
+    <w:p>
+      <w:pPr>
+        <w:pStyle w:val="FirstParagraph"/>
+      </w:pPr>
+      <w:r>
+        <w:t xml:space="preserve">Эмпирический метод: практическое выполнение заданий в виртуальной машине Fedora Linux с фиксацией результатов скриншотами и видеозаписью.</w:t>
+      </w:r>
+    </w:p>
+    <w:bookmarkEnd w:id="13"/>
+    <w:bookmarkStart w:id="14" w:name="схема-выполнения-работы"/>
+    <w:p>
+      <w:pPr>
+        <w:pStyle w:val="Heading2"/>
+      </w:pPr>
+      <w:r>
+        <w:t xml:space="preserve">1.6 Схема выполнения работы</w:t>
+      </w:r>
+    </w:p>
+    <w:p>
+      <w:pPr>
+        <w:pStyle w:val="FirstParagraph"/>
+      </w:pPr>
+      <w:r>
+        <w:t xml:space="preserve">Работа выполнялась по стандартной схеме курса: выполнение действия в виртуальной машине, фиксация скриншотом, занесение в отчёт, публикация в git-репозиторий отдельным релизом.</w:t>
+      </w:r>
+    </w:p>
+    <w:bookmarkEnd w:id="14"/>
+    <w:bookmarkEnd w:id="15"/>
+    <w:bookmarkStart w:id="16" w:name="теоретическая-часть"/>
     <w:p>
       <w:pPr>
         <w:pStyle w:val="Heading1"/>
       </w:pPr>
       <w:r>
-        <w:t xml:space="preserve">Выполнение лабораторной работы</w:t>
+        <w:t xml:space="preserve">2. Теоретическая часть</w:t>
       </w:r>
     </w:p>
     <w:p>
@@ -123,6 +247,71 @@
         <w:pStyle w:val="FirstParagraph"/>
       </w:pPr>
       <w:r>
+        <w:t xml:space="preserve">Расширенное программирование в shell включает работу с конкурентным доступом к общему ресурсу (простейшая синхронизация через файл-блокировку, аналог мьютекса), обёртки над системными утилитами и генерацию псевдослучайных данных через встроенную переменную</w:t>
+      </w:r>
+      <w:r>
+        <w:t xml:space="preserve"> </w:t>
+      </w:r>
+      <w:r>
+        <w:rPr>
+          <w:rStyle w:val="VerbatimChar"/>
+        </w:rPr>
+        <w:t xml:space="preserve">$RANDOM</w:t>
+      </w:r>
+      <w:r>
+        <w:t xml:space="preserve">.</w:t>
+      </w:r>
+    </w:p>
+    <w:p>
+      <w:pPr>
+        <w:pStyle w:val="BodyText"/>
+      </w:pPr>
+      <w:r>
+        <w:t xml:space="preserve">Более подробно см. в</w:t>
+      </w:r>
+      <w:r>
+        <w:t xml:space="preserve"> </w:t>
+      </w:r>
+      <w:r>
+        <w:t xml:space="preserve">[1]</w:t>
+      </w:r>
+      <w:r>
+        <w:t xml:space="preserve">.</w:t>
+      </w:r>
+    </w:p>
+    <w:bookmarkEnd w:id="16"/>
+    <w:bookmarkStart w:id="17" w:name="материалы-и-методы"/>
+    <w:p>
+      <w:pPr>
+        <w:pStyle w:val="Heading1"/>
+      </w:pPr>
+      <w:r>
+        <w:t xml:space="preserve">3. Материалы и методы</w:t>
+      </w:r>
+    </w:p>
+    <w:p>
+      <w:pPr>
+        <w:pStyle w:val="FirstParagraph"/>
+      </w:pPr>
+      <w:r>
+        <w:t xml:space="preserve">Используемое ПО и оборудование: хост-машина под управлением Windows, гипервизор VirtualBox, виртуальная машина с Fedora Linux (Sway), стандартные утилиты дистрибутива.</w:t>
+      </w:r>
+    </w:p>
+    <w:bookmarkEnd w:id="17"/>
+    <w:bookmarkStart w:id="39" w:name="выполнение-лабораторной-работы"/>
+    <w:p>
+      <w:pPr>
+        <w:pStyle w:val="Heading1"/>
+      </w:pPr>
+      <w:r>
+        <w:t xml:space="preserve">4. Выполнение лабораторной работы</w:t>
+      </w:r>
+    </w:p>
+    <w:p>
+      <w:pPr>
+        <w:pStyle w:val="FirstParagraph"/>
+      </w:pPr>
+      <w:r>
         <w:t xml:space="preserve">Создаём рабочий каталог и пишем скрипт семафора через heredoc:</w:t>
       </w:r>
       <w:r>
@@ -191,25 +380,25 @@
     </w:p>
     <w:p>
       <w:pPr>
-        <w:pStyle w:val="BodyText"/>
+        <w:pStyle w:val="CaptionedFigure"/>
       </w:pPr>
       <w:r>
         <w:drawing>
           <wp:inline>
             <wp:extent cx="3733800" cy="2100262"/>
             <wp:effectExtent b="0" l="0" r="0" t="0"/>
-            <wp:docPr descr="" title="" id="12" name="Picture"/>
+            <wp:docPr descr="Создаём рабочий каталог и пишем скрипт семафора через heredoc: mkdir -p ~/work/os/lab14, cat &gt; task1_sem.sh &lt;&lt; 'EOF'. Скрипт принимает время ожидания t1 и время занятия ресурса t2, использует файл-блокировку /tmp/resource.lock" title="" id="19" name="Picture"/>
             <a:graphic>
               <a:graphicData uri="http://schemas.openxmlformats.org/drawingml/2006/picture">
                 <pic:pic>
                   <pic:nvPicPr>
-                    <pic:cNvPr descr="фото/1.png" id="13" name="Picture"/>
+                    <pic:cNvPr descr="image/1.png" id="20" name="Picture"/>
                     <pic:cNvPicPr>
                       <a:picLocks noChangeArrowheads="1" noChangeAspect="1"/>
                     </pic:cNvPicPr>
                   </pic:nvPicPr>
                   <pic:blipFill>
-                    <a:blip r:embed="rId11"/>
+                    <a:blip r:embed="rId18"/>
                     <a:stretch>
                       <a:fillRect/>
                     </a:stretch>
@@ -238,6 +427,74 @@
     </w:p>
     <w:p>
       <w:pPr>
+        <w:pStyle w:val="ImageCaption"/>
+      </w:pPr>
+      <w:r>
+        <w:t xml:space="preserve">Создаём рабочий каталог и пишем скрипт семафора через heredoc:</w:t>
+      </w:r>
+      <w:r>
+        <w:t xml:space="preserve"> </w:t>
+      </w:r>
+      <w:r>
+        <w:rPr>
+          <w:rStyle w:val="VerbatimChar"/>
+        </w:rPr>
+        <w:t xml:space="preserve">mkdir -p ~/work/os/lab14</w:t>
+      </w:r>
+      <w:r>
+        <w:t xml:space="preserve">,</w:t>
+      </w:r>
+      <w:r>
+        <w:t xml:space="preserve"> </w:t>
+      </w:r>
+      <w:r>
+        <w:rPr>
+          <w:rStyle w:val="VerbatimChar"/>
+        </w:rPr>
+        <w:t xml:space="preserve">cat &gt; task1_sem.sh &lt;&lt; 'EOF'</w:t>
+      </w:r>
+      <w:r>
+        <w:t xml:space="preserve">. Скрипт принимает время ожидания</w:t>
+      </w:r>
+      <w:r>
+        <w:t xml:space="preserve"> </w:t>
+      </w:r>
+      <w:r>
+        <w:rPr>
+          <w:rStyle w:val="VerbatimChar"/>
+        </w:rPr>
+        <w:t xml:space="preserve">t1</w:t>
+      </w:r>
+      <w:r>
+        <w:t xml:space="preserve"> </w:t>
+      </w:r>
+      <w:r>
+        <w:t xml:space="preserve">и время занятия ресурса</w:t>
+      </w:r>
+      <w:r>
+        <w:t xml:space="preserve"> </w:t>
+      </w:r>
+      <w:r>
+        <w:rPr>
+          <w:rStyle w:val="VerbatimChar"/>
+        </w:rPr>
+        <w:t xml:space="preserve">t2</w:t>
+      </w:r>
+      <w:r>
+        <w:t xml:space="preserve">, использует файл-блокировку</w:t>
+      </w:r>
+      <w:r>
+        <w:t xml:space="preserve"> </w:t>
+      </w:r>
+      <w:r>
+        <w:rPr>
+          <w:rStyle w:val="VerbatimChar"/>
+        </w:rPr>
+        <w:t xml:space="preserve">/tmp/resource.lock</w:t>
+      </w:r>
+    </w:p>
+    <w:p>
+      <w:pPr>
         <w:pStyle w:val="BodyText"/>
       </w:pPr>
       <w:r>
@@ -312,25 +569,25 @@
     </w:p>
     <w:p>
       <w:pPr>
-        <w:pStyle w:val="BodyText"/>
+        <w:pStyle w:val="CaptionedFigure"/>
       </w:pPr>
       <w:r>
         <w:drawing>
           <wp:inline>
             <wp:extent cx="3733800" cy="2100262"/>
             <wp:effectExtent b="0" l="0" r="0" t="0"/>
-            <wp:docPr descr="" title="" id="15" name="Picture"/>
+            <wp:docPr descr="Полный текст task1_sem.sh: цикл ожидания освобождения ресурса (с сообщениями и счётчиком w), затем touch &quot;$LOCK&quot; и занятие ресурса на t2 секунд, в конце rm -f &quot;$LOCK&quot;" title="" id="22" name="Picture"/>
             <a:graphic>
               <a:graphicData uri="http://schemas.openxmlformats.org/drawingml/2006/picture">
                 <pic:pic>
                   <pic:nvPicPr>
-                    <pic:cNvPr descr="фото/2.png" id="16" name="Picture"/>
+                    <pic:cNvPr descr="image/2.png" id="23" name="Picture"/>
                     <pic:cNvPicPr>
                       <a:picLocks noChangeArrowheads="1" noChangeAspect="1"/>
                     </pic:cNvPicPr>
                   </pic:nvPicPr>
                   <pic:blipFill>
-                    <a:blip r:embed="rId14"/>
+                    <a:blip r:embed="rId21"/>
                     <a:stretch>
                       <a:fillRect/>
                     </a:stretch>
@@ -359,6 +616,77 @@
     </w:p>
     <w:p>
       <w:pPr>
+        <w:pStyle w:val="ImageCaption"/>
+      </w:pPr>
+      <w:r>
+        <w:t xml:space="preserve">Полный текст</w:t>
+      </w:r>
+      <w:r>
+        <w:t xml:space="preserve"> </w:t>
+      </w:r>
+      <w:r>
+        <w:rPr>
+          <w:rStyle w:val="VerbatimChar"/>
+        </w:rPr>
+        <w:t xml:space="preserve">task1_sem.sh</w:t>
+      </w:r>
+      <w:r>
+        <w:t xml:space="preserve">: цикл ожидания освобождения ресурса (с сообщениями и счётчиком</w:t>
+      </w:r>
+      <w:r>
+        <w:t xml:space="preserve"> </w:t>
+      </w:r>
+      <w:r>
+        <w:rPr>
+          <w:rStyle w:val="VerbatimChar"/>
+        </w:rPr>
+        <w:t xml:space="preserve">w</w:t>
+      </w:r>
+      <w:r>
+        <w:t xml:space="preserve">), затем</w:t>
+      </w:r>
+      <w:r>
+        <w:t xml:space="preserve"> </w:t>
+      </w:r>
+      <w:r>
+        <w:rPr>
+          <w:rStyle w:val="VerbatimChar"/>
+        </w:rPr>
+        <w:t xml:space="preserve">touch "$LOCK"</w:t>
+      </w:r>
+      <w:r>
+        <w:t xml:space="preserve"> </w:t>
+      </w:r>
+      <w:r>
+        <w:t xml:space="preserve">и занятие ресурса на</w:t>
+      </w:r>
+      <w:r>
+        <w:t xml:space="preserve"> </w:t>
+      </w:r>
+      <w:r>
+        <w:rPr>
+          <w:rStyle w:val="VerbatimChar"/>
+        </w:rPr>
+        <w:t xml:space="preserve">t2</w:t>
+      </w:r>
+      <w:r>
+        <w:t xml:space="preserve"> </w:t>
+      </w:r>
+      <w:r>
+        <w:t xml:space="preserve">секунд, в конце</w:t>
+      </w:r>
+      <w:r>
+        <w:t xml:space="preserve"> </w:t>
+      </w:r>
+      <w:r>
+        <w:rPr>
+          <w:rStyle w:val="VerbatimChar"/>
+        </w:rPr>
+        <w:t xml:space="preserve">rm -f "$LOCK"</w:t>
+      </w:r>
+    </w:p>
+    <w:p>
+      <w:pPr>
         <w:pStyle w:val="BodyText"/>
       </w:pPr>
       <w:r>
@@ -403,25 +731,25 @@
     </w:p>
     <w:p>
       <w:pPr>
-        <w:pStyle w:val="BodyText"/>
+        <w:pStyle w:val="CaptionedFigure"/>
       </w:pPr>
       <w:r>
         <w:drawing>
           <wp:inline>
             <wp:extent cx="3733800" cy="2100262"/>
             <wp:effectExtent b="0" l="0" r="0" t="0"/>
-            <wp:docPr descr="" title="" id="18" name="Picture"/>
+            <wp:docPr descr="Даём права на выполнение и тестируем: chmod +x task1_sem.sh, ./task1_sem.sh 2 4 — скрипт занимает ресурс и удерживает его 4 секунды с выводом PID ($$)" title="" id="25" name="Picture"/>
             <a:graphic>
               <a:graphicData uri="http://schemas.openxmlformats.org/drawingml/2006/picture">
                 <pic:pic>
                   <pic:nvPicPr>
-                    <pic:cNvPr descr="фото/3.png" id="19" name="Picture"/>
+                    <pic:cNvPr descr="image/3.png" id="26" name="Picture"/>
                     <pic:cNvPicPr>
                       <a:picLocks noChangeArrowheads="1" noChangeAspect="1"/>
                     </pic:cNvPicPr>
                   </pic:nvPicPr>
                   <pic:blipFill>
-                    <a:blip r:embed="rId17"/>
+                    <a:blip r:embed="rId24"/>
                     <a:stretch>
                       <a:fillRect/>
                     </a:stretch>
@@ -450,6 +778,50 @@
     </w:p>
     <w:p>
       <w:pPr>
+        <w:pStyle w:val="ImageCaption"/>
+      </w:pPr>
+      <w:r>
+        <w:t xml:space="preserve">Даём права на выполнение и тестируем:</w:t>
+      </w:r>
+      <w:r>
+        <w:t xml:space="preserve"> </w:t>
+      </w:r>
+      <w:r>
+        <w:rPr>
+          <w:rStyle w:val="VerbatimChar"/>
+        </w:rPr>
+        <w:t xml:space="preserve">chmod +x task1_sem.sh</w:t>
+      </w:r>
+      <w:r>
+        <w:t xml:space="preserve">,</w:t>
+      </w:r>
+      <w:r>
+        <w:t xml:space="preserve"> </w:t>
+      </w:r>
+      <w:r>
+        <w:rPr>
+          <w:rStyle w:val="VerbatimChar"/>
+        </w:rPr>
+        <w:t xml:space="preserve">./task1_sem.sh 2 4</w:t>
+      </w:r>
+      <w:r>
+        <w:t xml:space="preserve"> </w:t>
+      </w:r>
+      <w:r>
+        <w:t xml:space="preserve">— скрипт занимает ресурс и удерживает его 4 секунды с выводом PID (</w:t>
+      </w:r>
+      <w:r>
+        <w:rPr>
+          <w:rStyle w:val="VerbatimChar"/>
+        </w:rPr>
+        <w:t xml:space="preserve">$$</w:t>
+      </w:r>
+      <w:r>
+        <w:t xml:space="preserve">)</w:t>
+      </w:r>
+    </w:p>
+    <w:p>
+      <w:pPr>
         <w:pStyle w:val="BodyText"/>
       </w:pPr>
       <w:r>
@@ -521,25 +893,25 @@
     </w:p>
     <w:p>
       <w:pPr>
-        <w:pStyle w:val="BodyText"/>
+        <w:pStyle w:val="CaptionedFigure"/>
       </w:pPr>
       <w:r>
         <w:drawing>
           <wp:inline>
             <wp:extent cx="3733800" cy="2100262"/>
             <wp:effectExtent b="0" l="0" r="0" t="0"/>
-            <wp:docPr descr="" title="" id="21" name="Picture"/>
+            <wp:docPr descr="Пишем аналог man: cat &gt; task2_man.sh &lt;&lt; 'EOF'. Скрипт ищет файл справки по имени команды в /usr/share/man/man1 через ls | grep, открывает через less, при отсутствии — выводит сообщение" title="" id="28" name="Picture"/>
             <a:graphic>
               <a:graphicData uri="http://schemas.openxmlformats.org/drawingml/2006/picture">
                 <pic:pic>
                   <pic:nvPicPr>
-                    <pic:cNvPr descr="фото/4.png" id="22" name="Picture"/>
+                    <pic:cNvPr descr="image/4.png" id="29" name="Picture"/>
                     <pic:cNvPicPr>
                       <a:picLocks noChangeArrowheads="1" noChangeAspect="1"/>
                     </pic:cNvPicPr>
                   </pic:nvPicPr>
                   <pic:blipFill>
-                    <a:blip r:embed="rId20"/>
+                    <a:blip r:embed="rId27"/>
                     <a:stretch>
                       <a:fillRect/>
                     </a:stretch>
@@ -568,6 +940,77 @@
     </w:p>
     <w:p>
       <w:pPr>
+        <w:pStyle w:val="ImageCaption"/>
+      </w:pPr>
+      <w:r>
+        <w:t xml:space="preserve">Пишем аналог</w:t>
+      </w:r>
+      <w:r>
+        <w:t xml:space="preserve"> </w:t>
+      </w:r>
+      <w:r>
+        <w:rPr>
+          <w:rStyle w:val="VerbatimChar"/>
+        </w:rPr>
+        <w:t xml:space="preserve">man</w:t>
+      </w:r>
+      <w:r>
+        <w:t xml:space="preserve">:</w:t>
+      </w:r>
+      <w:r>
+        <w:t xml:space="preserve"> </w:t>
+      </w:r>
+      <w:r>
+        <w:rPr>
+          <w:rStyle w:val="VerbatimChar"/>
+        </w:rPr>
+        <w:t xml:space="preserve">cat &gt; task2_man.sh &lt;&lt; 'EOF'</w:t>
+      </w:r>
+      <w:r>
+        <w:t xml:space="preserve">. Скрипт ищет файл справки по имени команды в</w:t>
+      </w:r>
+      <w:r>
+        <w:t xml:space="preserve"> </w:t>
+      </w:r>
+      <w:r>
+        <w:rPr>
+          <w:rStyle w:val="VerbatimChar"/>
+        </w:rPr>
+        <w:t xml:space="preserve">/usr/share/man/man1</w:t>
+      </w:r>
+      <w:r>
+        <w:t xml:space="preserve"> </w:t>
+      </w:r>
+      <w:r>
+        <w:t xml:space="preserve">через</w:t>
+      </w:r>
+      <w:r>
+        <w:t xml:space="preserve"> </w:t>
+      </w:r>
+      <w:r>
+        <w:rPr>
+          <w:rStyle w:val="VerbatimChar"/>
+        </w:rPr>
+        <w:t xml:space="preserve">ls | grep</w:t>
+      </w:r>
+      <w:r>
+        <w:t xml:space="preserve">, открывает через</w:t>
+      </w:r>
+      <w:r>
+        <w:t xml:space="preserve"> </w:t>
+      </w:r>
+      <w:r>
+        <w:rPr>
+          <w:rStyle w:val="VerbatimChar"/>
+        </w:rPr>
+        <w:t xml:space="preserve">less</w:t>
+      </w:r>
+      <w:r>
+        <w:t xml:space="preserve">, при отсутствии — выводит сообщение</w:t>
+      </w:r>
+    </w:p>
+    <w:p>
+      <w:pPr>
         <w:pStyle w:val="BodyText"/>
       </w:pPr>
       <w:r>
@@ -630,25 +1073,25 @@
     </w:p>
     <w:p>
       <w:pPr>
-        <w:pStyle w:val="BodyText"/>
+        <w:pStyle w:val="CaptionedFigure"/>
       </w:pPr>
       <w:r>
         <w:drawing>
           <wp:inline>
             <wp:extent cx="3733800" cy="2100262"/>
             <wp:effectExtent b="0" l="0" r="0" t="0"/>
-            <wp:docPr descr="" title="" id="24" name="Picture"/>
+            <wp:docPr descr="Тестируем: chmod +x task2_man.sh, ./task2_man.sh ls открывает страницу справки, ./task2_man.sh без аргумента выводит Справка для '' не найдена" title="" id="31" name="Picture"/>
             <a:graphic>
               <a:graphicData uri="http://schemas.openxmlformats.org/drawingml/2006/picture">
                 <pic:pic>
                   <pic:nvPicPr>
-                    <pic:cNvPr descr="фото/5.png" id="25" name="Picture"/>
+                    <pic:cNvPr descr="image/5.png" id="32" name="Picture"/>
                     <pic:cNvPicPr>
                       <a:picLocks noChangeArrowheads="1" noChangeAspect="1"/>
                     </pic:cNvPicPr>
                   </pic:nvPicPr>
                   <pic:blipFill>
-                    <a:blip r:embed="rId23"/>
+                    <a:blip r:embed="rId30"/>
                     <a:stretch>
                       <a:fillRect/>
                     </a:stretch>
@@ -677,6 +1120,65 @@
     </w:p>
     <w:p>
       <w:pPr>
+        <w:pStyle w:val="ImageCaption"/>
+      </w:pPr>
+      <w:r>
+        <w:t xml:space="preserve">Тестируем:</w:t>
+      </w:r>
+      <w:r>
+        <w:t xml:space="preserve"> </w:t>
+      </w:r>
+      <w:r>
+        <w:rPr>
+          <w:rStyle w:val="VerbatimChar"/>
+        </w:rPr>
+        <w:t xml:space="preserve">chmod +x task2_man.sh</w:t>
+      </w:r>
+      <w:r>
+        <w:t xml:space="preserve">,</w:t>
+      </w:r>
+      <w:r>
+        <w:t xml:space="preserve"> </w:t>
+      </w:r>
+      <w:r>
+        <w:rPr>
+          <w:rStyle w:val="VerbatimChar"/>
+        </w:rPr>
+        <w:t xml:space="preserve">./task2_man.sh ls</w:t>
+      </w:r>
+      <w:r>
+        <w:t xml:space="preserve"> </w:t>
+      </w:r>
+      <w:r>
+        <w:t xml:space="preserve">открывает страницу справки,</w:t>
+      </w:r>
+      <w:r>
+        <w:t xml:space="preserve"> </w:t>
+      </w:r>
+      <w:r>
+        <w:rPr>
+          <w:rStyle w:val="VerbatimChar"/>
+        </w:rPr>
+        <w:t xml:space="preserve">./task2_man.sh</w:t>
+      </w:r>
+      <w:r>
+        <w:t xml:space="preserve"> </w:t>
+      </w:r>
+      <w:r>
+        <w:t xml:space="preserve">без аргумента выводит</w:t>
+      </w:r>
+      <w:r>
+        <w:t xml:space="preserve"> </w:t>
+      </w:r>
+      <w:r>
+        <w:rPr>
+          <w:rStyle w:val="VerbatimChar"/>
+        </w:rPr>
+        <w:t xml:space="preserve">Справка для '' не найдена</w:t>
+      </w:r>
+    </w:p>
+    <w:p>
+      <w:pPr>
         <w:pStyle w:val="BodyText"/>
       </w:pPr>
       <w:r>
@@ -709,25 +1211,25 @@
     </w:p>
     <w:p>
       <w:pPr>
-        <w:pStyle w:val="BodyText"/>
+        <w:pStyle w:val="CaptionedFigure"/>
       </w:pPr>
       <w:r>
         <w:drawing>
           <wp:inline>
             <wp:extent cx="3733800" cy="2100262"/>
             <wp:effectExtent b="0" l="0" r="0" t="0"/>
-            <wp:docPr descr="" title="" id="27" name="Picture"/>
+            <wp:docPr descr="Пишем генератор случайных букв: cat &gt; task3_random.sh &lt;&lt; 'EOF'. Число букв берётся первым аргументом (по умолчанию 10), каждая буква — случайный символ из алфавита через ${chars:$((RANDOM%26)):1}" title="" id="34" name="Picture"/>
             <a:graphic>
               <a:graphicData uri="http://schemas.openxmlformats.org/drawingml/2006/picture">
                 <pic:pic>
                   <pic:nvPicPr>
-                    <pic:cNvPr descr="фото/6.png" id="28" name="Picture"/>
+                    <pic:cNvPr descr="image/6.png" id="35" name="Picture"/>
                     <pic:cNvPicPr>
                       <a:picLocks noChangeArrowheads="1" noChangeAspect="1"/>
                     </pic:cNvPicPr>
                   </pic:nvPicPr>
                   <pic:blipFill>
-                    <a:blip r:embed="rId26"/>
+                    <a:blip r:embed="rId33"/>
                     <a:stretch>
                       <a:fillRect/>
                     </a:stretch>
@@ -756,6 +1258,35 @@
     </w:p>
     <w:p>
       <w:pPr>
+        <w:pStyle w:val="ImageCaption"/>
+      </w:pPr>
+      <w:r>
+        <w:t xml:space="preserve">Пишем генератор случайных букв:</w:t>
+      </w:r>
+      <w:r>
+        <w:t xml:space="preserve"> </w:t>
+      </w:r>
+      <w:r>
+        <w:rPr>
+          <w:rStyle w:val="VerbatimChar"/>
+        </w:rPr>
+        <w:t xml:space="preserve">cat &gt; task3_random.sh &lt;&lt; 'EOF'</w:t>
+      </w:r>
+      <w:r>
+        <w:t xml:space="preserve">. Число букв берётся первым аргументом (по умолчанию 10), каждая буква — случайный символ из алфавита через</w:t>
+      </w:r>
+      <w:r>
+        <w:t xml:space="preserve"> </w:t>
+      </w:r>
+      <w:r>
+        <w:rPr>
+          <w:rStyle w:val="VerbatimChar"/>
+        </w:rPr>
+        <w:t xml:space="preserve">${chars:$((RANDOM%26)):1}</w:t>
+      </w:r>
+    </w:p>
+    <w:p>
+      <w:pPr>
         <w:pStyle w:val="BodyText"/>
       </w:pPr>
       <w:r>
@@ -827,25 +1358,25 @@
     </w:p>
     <w:p>
       <w:pPr>
-        <w:pStyle w:val="BodyText"/>
+        <w:pStyle w:val="CaptionedFigure"/>
       </w:pPr>
       <w:r>
         <w:drawing>
           <wp:inline>
             <wp:extent cx="3733800" cy="2100262"/>
             <wp:effectExtent b="0" l="0" r="0" t="0"/>
-            <wp:docPr descr="" title="" id="30" name="Picture"/>
+            <wp:docPr descr="Запускаем: ./task3_random.sh 15 и ./task3_random.sh. Замечаем опечатку в алфавите (пропущена буква j) и исправляем на месте через sed -i 's/.../.../ ' task3_random.sh, проверяем результат через grep chars" title="" id="37" name="Picture"/>
             <a:graphic>
               <a:graphicData uri="http://schemas.openxmlformats.org/drawingml/2006/picture">
                 <pic:pic>
                   <pic:nvPicPr>
-                    <pic:cNvPr descr="фото/7.png" id="31" name="Picture"/>
+                    <pic:cNvPr descr="image/7.png" id="38" name="Picture"/>
                     <pic:cNvPicPr>
                       <a:picLocks noChangeArrowheads="1" noChangeAspect="1"/>
                     </pic:cNvPicPr>
                   </pic:nvPicPr>
                   <pic:blipFill>
-                    <a:blip r:embed="rId29"/>
+                    <a:blip r:embed="rId36"/>
                     <a:stretch>
                       <a:fillRect/>
                     </a:stretch>
@@ -872,14 +1403,82 @@
         </w:drawing>
       </w:r>
     </w:p>
-    <w:bookmarkEnd w:id="32"/>
-    <w:bookmarkStart w:id="33" w:name="выводы"/>
+    <w:p>
+      <w:pPr>
+        <w:pStyle w:val="ImageCaption"/>
+      </w:pPr>
+      <w:r>
+        <w:t xml:space="preserve">Запускаем:</w:t>
+      </w:r>
+      <w:r>
+        <w:t xml:space="preserve"> </w:t>
+      </w:r>
+      <w:r>
+        <w:rPr>
+          <w:rStyle w:val="VerbatimChar"/>
+        </w:rPr>
+        <w:t xml:space="preserve">./task3_random.sh 15</w:t>
+      </w:r>
+      <w:r>
+        <w:t xml:space="preserve"> </w:t>
+      </w:r>
+      <w:r>
+        <w:t xml:space="preserve">и</w:t>
+      </w:r>
+      <w:r>
+        <w:t xml:space="preserve"> </w:t>
+      </w:r>
+      <w:r>
+        <w:rPr>
+          <w:rStyle w:val="VerbatimChar"/>
+        </w:rPr>
+        <w:t xml:space="preserve">./task3_random.sh</w:t>
+      </w:r>
+      <w:r>
+        <w:t xml:space="preserve">. Замечаем опечатку в алфавите (пропущена буква</w:t>
+      </w:r>
+      <w:r>
+        <w:t xml:space="preserve"> </w:t>
+      </w:r>
+      <w:r>
+        <w:rPr>
+          <w:rStyle w:val="VerbatimChar"/>
+        </w:rPr>
+        <w:t xml:space="preserve">j</w:t>
+      </w:r>
+      <w:r>
+        <w:t xml:space="preserve">) и исправляем на месте через</w:t>
+      </w:r>
+      <w:r>
+        <w:t xml:space="preserve"> </w:t>
+      </w:r>
+      <w:r>
+        <w:rPr>
+          <w:rStyle w:val="VerbatimChar"/>
+        </w:rPr>
+        <w:t xml:space="preserve">sed -i 's/.../.../ ' task3_random.sh</w:t>
+      </w:r>
+      <w:r>
+        <w:t xml:space="preserve">, проверяем результат через</w:t>
+      </w:r>
+      <w:r>
+        <w:t xml:space="preserve"> </w:t>
+      </w:r>
+      <w:r>
+        <w:rPr>
+          <w:rStyle w:val="VerbatimChar"/>
+        </w:rPr>
+        <w:t xml:space="preserve">grep chars</w:t>
+      </w:r>
+    </w:p>
+    <w:bookmarkEnd w:id="39"/>
+    <w:bookmarkStart w:id="40" w:name="результаты"/>
     <w:p>
       <w:pPr>
         <w:pStyle w:val="Heading1"/>
       </w:pPr>
       <w:r>
-        <w:t xml:space="preserve">Выводы</w:t>
+        <w:t xml:space="preserve">5. Результаты</w:t>
       </w:r>
     </w:p>
     <w:p>
@@ -887,6 +1486,66 @@
         <w:pStyle w:val="FirstParagraph"/>
       </w:pPr>
       <w:r>
+        <w:t xml:space="preserve">В ходе выполнения работы получены следующие объективные результаты: Освоены командные файлы с циклами и условиями: упрощённый семафор на основе файла-блокировки для синхронизации процессов, обёртка над</w:t>
+      </w:r>
+      <w:r>
+        <w:t xml:space="preserve"> </w:t>
+      </w:r>
+      <w:r>
+        <w:rPr>
+          <w:rStyle w:val="VerbatimChar"/>
+        </w:rPr>
+        <w:t xml:space="preserve">man</w:t>
+      </w:r>
+      <w:r>
+        <w:t xml:space="preserve">, генератор случайных латинских букв через</w:t>
+      </w:r>
+      <w:r>
+        <w:t xml:space="preserve"> </w:t>
+      </w:r>
+      <w:r>
+        <w:rPr>
+          <w:rStyle w:val="VerbatimChar"/>
+        </w:rPr>
+        <w:t xml:space="preserve">$RANDOM</w:t>
+      </w:r>
+      <w:r>
+        <w:t xml:space="preserve">.</w:t>
+      </w:r>
+    </w:p>
+    <w:bookmarkEnd w:id="40"/>
+    <w:bookmarkStart w:id="41" w:name="обсуждение-результатов"/>
+    <w:p>
+      <w:pPr>
+        <w:pStyle w:val="Heading1"/>
+      </w:pPr>
+      <w:r>
+        <w:t xml:space="preserve">6. Обсуждение результатов</w:t>
+      </w:r>
+    </w:p>
+    <w:p>
+      <w:pPr>
+        <w:pStyle w:val="FirstParagraph"/>
+      </w:pPr>
+      <w:r>
+        <w:t xml:space="preserve">Семафор на основе файла-блокировки корректно предотвратил одновременный доступ к ресурсу; обнаруженная опечатка в алфавите генератора была исправлена и проверена повторным запуском.</w:t>
+      </w:r>
+    </w:p>
+    <w:bookmarkEnd w:id="41"/>
+    <w:bookmarkStart w:id="42" w:name="заключение"/>
+    <w:p>
+      <w:pPr>
+        <w:pStyle w:val="Heading1"/>
+      </w:pPr>
+      <w:r>
+        <w:t xml:space="preserve">7. Заключение</w:t>
+      </w:r>
+    </w:p>
+    <w:p>
+      <w:pPr>
+        <w:pStyle w:val="FirstParagraph"/>
+      </w:pPr>
+      <w:r>
         <w:t xml:space="preserve">Освоены командные файлы с циклами и условиями: упрощённый семафор на основе файла-блокировки для синхронизации процессов, обёртка над</w:t>
       </w:r>
       <w:r>
@@ -914,8 +1573,39 @@
         <w:t xml:space="preserve">.</w:t>
       </w:r>
     </w:p>
-    <w:bookmarkEnd w:id="33"/>
-    <w:bookmarkStart w:id="34" w:name="ответы-на-контрольные-вопросы"/>
+    <w:bookmarkEnd w:id="42"/>
+    <w:bookmarkStart w:id="45" w:name="список-литературы"/>
+    <w:p>
+      <w:pPr>
+        <w:pStyle w:val="Heading1"/>
+      </w:pPr>
+      <w:r>
+        <w:t xml:space="preserve">Список литературы</w:t>
+      </w:r>
+    </w:p>
+    <w:bookmarkStart w:id="44" w:name="refs"/>
+    <w:bookmarkStart w:id="43" w:name="ref-robbins_book_bash_en"/>
+    <w:p>
+      <w:pPr>
+        <w:pStyle w:val="Bibliography"/>
+      </w:pPr>
+      <w:r>
+        <w:t xml:space="preserve">1.</w:t>
+      </w:r>
+      <w:r>
+        <w:t xml:space="preserve"> </w:t>
+      </w:r>
+      <w:r>
+        <w:t xml:space="preserve">	</w:t>
+      </w:r>
+      <w:r>
+        <w:t xml:space="preserve">Robbins A. Bash Pocket Reference. O’Reilly Media, 2016.</w:t>
+      </w:r>
+    </w:p>
+    <w:bookmarkEnd w:id="43"/>
+    <w:bookmarkEnd w:id="44"/>
+    <w:bookmarkEnd w:id="45"/>
+    <w:bookmarkStart w:id="46" w:name="ответы-на-контрольные-вопросы"/>
     <w:p>
       <w:pPr>
         <w:pStyle w:val="Heading1"/>
@@ -1241,7 +1931,7 @@
         <w:t xml:space="preserve">Плюс — быстрая автоматизация системных задач без компиляции; минус — низкая производительность и плохая читаемость сложной логики.</w:t>
       </w:r>
     </w:p>
-    <w:bookmarkEnd w:id="34"/>
+    <w:bookmarkEnd w:id="46"/>
     <w:sectPr>
       <w:footnotePr>
         <w:numRestart w:val="eachSect"/>
@@ -1472,7 +2162,7 @@
         <w:rFonts w:asciiTheme="minorHAnsi" w:cstheme="minorBidi" w:eastAsiaTheme="minorEastAsia" w:hAnsiTheme="minorHAnsi"/>
         <w:sz w:val="24"/>
         <w:szCs w:val="24"/>
-        <w:lang w:bidi="ar-SA" w:eastAsia="zh-CN" w:val="en-US"/>
+        <w:lang w:bidi="ar-SA" w:eastAsia="zh-CN" w:val="ru-RU"/>
       </w:rPr>
     </w:rPrDefault>
     <w:pPrDefault>
@@ -2126,6 +2816,7 @@
     <w:link w:val="VerbatimChar"/>
     <w:pPr>
       <w:wordWrap w:val="off"/>
+      <w:shd w:val="clear" w:fill="f1f3f5"/>
     </w:pPr>
   </w:style>
   <w:style w:type="character" w:customStyle="1" w:styleId="KeywordTok">
@@ -2133,93 +2824,104 @@
     <w:basedOn w:val="VerbatimChar"/>
     <w:rPr>
       <w:b/>
-      <w:color w:val="007020"/>
+      <w:color w:val="003b4f"/>
+      <w:shd w:val="clear" w:fill="f1f3f5"/>
     </w:rPr>
   </w:style>
   <w:style w:type="character" w:customStyle="1" w:styleId="DataTypeTok">
     <w:name w:val="DataTypeTok"/>
     <w:basedOn w:val="VerbatimChar"/>
     <w:rPr>
-      <w:color w:val="902000"/>
+      <w:color w:val="ad0000"/>
+      <w:shd w:val="clear" w:fill="f1f3f5"/>
     </w:rPr>
   </w:style>
   <w:style w:type="character" w:customStyle="1" w:styleId="DecValTok">
     <w:name w:val="DecValTok"/>
     <w:basedOn w:val="VerbatimChar"/>
     <w:rPr>
-      <w:color w:val="40a070"/>
+      <w:color w:val="ad0000"/>
+      <w:shd w:val="clear" w:fill="f1f3f5"/>
     </w:rPr>
   </w:style>
   <w:style w:type="character" w:customStyle="1" w:styleId="BaseNTok">
     <w:name w:val="BaseNTok"/>
     <w:basedOn w:val="VerbatimChar"/>
     <w:rPr>
-      <w:color w:val="40a070"/>
+      <w:color w:val="ad0000"/>
+      <w:shd w:val="clear" w:fill="f1f3f5"/>
     </w:rPr>
   </w:style>
   <w:style w:type="character" w:customStyle="1" w:styleId="FloatTok">
     <w:name w:val="FloatTok"/>
     <w:basedOn w:val="VerbatimChar"/>
     <w:rPr>
-      <w:color w:val="40a070"/>
+      <w:color w:val="ad0000"/>
+      <w:shd w:val="clear" w:fill="f1f3f5"/>
     </w:rPr>
   </w:style>
   <w:style w:type="character" w:customStyle="1" w:styleId="ConstantTok">
     <w:name w:val="ConstantTok"/>
     <w:basedOn w:val="VerbatimChar"/>
     <w:rPr>
-      <w:color w:val="880000"/>
+      <w:color w:val="8f5902"/>
+      <w:shd w:val="clear" w:fill="f1f3f5"/>
     </w:rPr>
   </w:style>
   <w:style w:type="character" w:customStyle="1" w:styleId="CharTok">
     <w:name w:val="CharTok"/>
     <w:basedOn w:val="VerbatimChar"/>
     <w:rPr>
-      <w:color w:val="4070a0"/>
+      <w:color w:val="20794d"/>
+      <w:shd w:val="clear" w:fill="f1f3f5"/>
     </w:rPr>
   </w:style>
   <w:style w:type="character" w:customStyle="1" w:styleId="SpecialCharTok">
     <w:name w:val="SpecialCharTok"/>
     <w:basedOn w:val="VerbatimChar"/>
     <w:rPr>
-      <w:color w:val="4070a0"/>
+      <w:color w:val="5e5e5e"/>
+      <w:shd w:val="clear" w:fill="f1f3f5"/>
     </w:rPr>
   </w:style>
   <w:style w:type="character" w:customStyle="1" w:styleId="StringTok">
     <w:name w:val="StringTok"/>
     <w:basedOn w:val="VerbatimChar"/>
     <w:rPr>
-      <w:color w:val="4070a0"/>
+      <w:color w:val="20794d"/>
+      <w:shd w:val="clear" w:fill="f1f3f5"/>
     </w:rPr>
   </w:style>
   <w:style w:type="character" w:customStyle="1" w:styleId="VerbatimStringTok">
     <w:name w:val="VerbatimStringTok"/>
     <w:basedOn w:val="VerbatimChar"/>
     <w:rPr>
-      <w:color w:val="4070a0"/>
+      <w:color w:val="20794d"/>
+      <w:shd w:val="clear" w:fill="f1f3f5"/>
     </w:rPr>
   </w:style>
   <w:style w:type="character" w:customStyle="1" w:styleId="SpecialStringTok">
     <w:name w:val="SpecialStringTok"/>
     <w:basedOn w:val="VerbatimChar"/>
     <w:rPr>
-      <w:color w:val="bb6688"/>
+      <w:color w:val="20794d"/>
+      <w:shd w:val="clear" w:fill="f1f3f5"/>
     </w:rPr>
   </w:style>
   <w:style w:type="character" w:customStyle="1" w:styleId="ImportTok">
     <w:name w:val="ImportTok"/>
     <w:basedOn w:val="VerbatimChar"/>
     <w:rPr>
-      <w:b/>
-      <w:color w:val="008000"/>
+      <w:color w:val="00769e"/>
+      <w:shd w:val="clear" w:fill="f1f3f5"/>
     </w:rPr>
   </w:style>
   <w:style w:type="character" w:customStyle="1" w:styleId="CommentTok">
     <w:name w:val="CommentTok"/>
     <w:basedOn w:val="VerbatimChar"/>
     <w:rPr>
-      <w:i/>
-      <w:color w:val="60a0b0"/>
+      <w:color w:val="5e5e5e"/>
+      <w:shd w:val="clear" w:fill="f1f3f5"/>
     </w:rPr>
   </w:style>
   <w:style w:type="character" w:customStyle="1" w:styleId="DocumentationTok">
@@ -2227,46 +2929,49 @@
     <w:basedOn w:val="VerbatimChar"/>
     <w:rPr>
       <w:i/>
-      <w:color w:val="ba2121"/>
+      <w:color w:val="5e5e5e"/>
+      <w:shd w:val="clear" w:fill="f1f3f5"/>
     </w:rPr>
   </w:style>
   <w:style w:type="character" w:customStyle="1" w:styleId="AnnotationTok">
     <w:name w:val="AnnotationTok"/>
     <w:basedOn w:val="VerbatimChar"/>
     <w:rPr>
-      <w:b/>
-      <w:i/>
-      <w:color w:val="60a0b0"/>
+      <w:color w:val="5e5e5e"/>
+      <w:shd w:val="clear" w:fill="f1f3f5"/>
     </w:rPr>
   </w:style>
   <w:style w:type="character" w:customStyle="1" w:styleId="CommentVarTok">
     <w:name w:val="CommentVarTok"/>
     <w:basedOn w:val="VerbatimChar"/>
     <w:rPr>
-      <w:b/>
       <w:i/>
-      <w:color w:val="60a0b0"/>
+      <w:color w:val="5e5e5e"/>
+      <w:shd w:val="clear" w:fill="f1f3f5"/>
     </w:rPr>
   </w:style>
   <w:style w:type="character" w:customStyle="1" w:styleId="OtherTok">
     <w:name w:val="OtherTok"/>
     <w:basedOn w:val="VerbatimChar"/>
     <w:rPr>
-      <w:color w:val="007020"/>
+      <w:color w:val="003b4f"/>
+      <w:shd w:val="clear" w:fill="f1f3f5"/>
     </w:rPr>
   </w:style>
   <w:style w:type="character" w:customStyle="1" w:styleId="FunctionTok">
     <w:name w:val="FunctionTok"/>
     <w:basedOn w:val="VerbatimChar"/>
     <w:rPr>
-      <w:color w:val="06287e"/>
+      <w:color w:val="4758ab"/>
+      <w:shd w:val="clear" w:fill="f1f3f5"/>
     </w:rPr>
   </w:style>
   <w:style w:type="character" w:customStyle="1" w:styleId="VariableTok">
     <w:name w:val="VariableTok"/>
     <w:basedOn w:val="VerbatimChar"/>
     <w:rPr>
-      <w:color w:val="19177c"/>
+      <w:color w:val="111111"/>
+      <w:shd w:val="clear" w:fill="f1f3f5"/>
     </w:rPr>
   </w:style>
   <w:style w:type="character" w:customStyle="1" w:styleId="ControlFlowTok">
@@ -2274,85 +2979,98 @@
     <w:basedOn w:val="VerbatimChar"/>
     <w:rPr>
       <w:b/>
-      <w:color w:val="007020"/>
+      <w:color w:val="003b4f"/>
+      <w:shd w:val="clear" w:fill="f1f3f5"/>
     </w:rPr>
   </w:style>
   <w:style w:type="character" w:customStyle="1" w:styleId="OperatorTok">
     <w:name w:val="OperatorTok"/>
     <w:basedOn w:val="VerbatimChar"/>
     <w:rPr>
-      <w:color w:val="666666"/>
+      <w:color w:val="5e5e5e"/>
+      <w:shd w:val="clear" w:fill="f1f3f5"/>
     </w:rPr>
   </w:style>
   <w:style w:type="character" w:customStyle="1" w:styleId="BuiltInTok">
     <w:name w:val="BuiltInTok"/>
     <w:basedOn w:val="VerbatimChar"/>
     <w:rPr>
-      <w:color w:val="008000"/>
+      <w:color w:val="003b4f"/>
+      <w:shd w:val="clear" w:fill="f1f3f5"/>
     </w:rPr>
   </w:style>
   <w:style w:type="character" w:customStyle="1" w:styleId="ExtensionTok">
     <w:name w:val="ExtensionTok"/>
     <w:basedOn w:val="VerbatimChar"/>
-    <w:rPr/>
+    <w:rPr>
+      <w:color w:val="003b4f"/>
+      <w:shd w:val="clear" w:fill="f1f3f5"/>
+    </w:rPr>
   </w:style>
   <w:style w:type="character" w:customStyle="1" w:styleId="PreprocessorTok">
     <w:name w:val="PreprocessorTok"/>
     <w:basedOn w:val="VerbatimChar"/>
     <w:rPr>
-      <w:color w:val="bc7a00"/>
+      <w:color w:val="ad0000"/>
+      <w:shd w:val="clear" w:fill="f1f3f5"/>
     </w:rPr>
   </w:style>
   <w:style w:type="character" w:customStyle="1" w:styleId="AttributeTok">
     <w:name w:val="AttributeTok"/>
     <w:basedOn w:val="VerbatimChar"/>
     <w:rPr>
-      <w:color w:val="7d9029"/>
+      <w:color w:val="657422"/>
+      <w:shd w:val="clear" w:fill="f1f3f5"/>
     </w:rPr>
   </w:style>
   <w:style w:type="character" w:customStyle="1" w:styleId="RegionMarkerTok">
     <w:name w:val="RegionMarkerTok"/>
     <w:basedOn w:val="VerbatimChar"/>
-    <w:rPr/>
+    <w:rPr>
+      <w:color w:val="003b4f"/>
+      <w:shd w:val="clear" w:fill="f1f3f5"/>
+    </w:rPr>
   </w:style>
   <w:style w:type="character" w:customStyle="1" w:styleId="InformationTok">
     <w:name w:val="InformationTok"/>
     <w:basedOn w:val="VerbatimChar"/>
     <w:rPr>
-      <w:b/>
-      <w:i/>
-      <w:color w:val="60a0b0"/>
+      <w:color w:val="5e5e5e"/>
+      <w:shd w:val="clear" w:fill="f1f3f5"/>
     </w:rPr>
   </w:style>
   <w:style w:type="character" w:customStyle="1" w:styleId="WarningTok">
     <w:name w:val="WarningTok"/>
     <w:basedOn w:val="VerbatimChar"/>
     <w:rPr>
-      <w:b/>
       <w:i/>
-      <w:color w:val="60a0b0"/>
+      <w:color w:val="5e5e5e"/>
+      <w:shd w:val="clear" w:fill="f1f3f5"/>
     </w:rPr>
   </w:style>
   <w:style w:type="character" w:customStyle="1" w:styleId="AlertTok">
     <w:name w:val="AlertTok"/>
     <w:basedOn w:val="VerbatimChar"/>
     <w:rPr>
-      <w:b/>
-      <w:color w:val="ff0000"/>
+      <w:color w:val="ad0000"/>
+      <w:shd w:val="clear" w:fill="f1f3f5"/>
     </w:rPr>
   </w:style>
   <w:style w:type="character" w:customStyle="1" w:styleId="ErrorTok">
     <w:name w:val="ErrorTok"/>
     <w:basedOn w:val="VerbatimChar"/>
     <w:rPr>
-      <w:b/>
-      <w:color w:val="ff0000"/>
+      <w:color w:val="ad0000"/>
+      <w:shd w:val="clear" w:fill="f1f3f5"/>
     </w:rPr>
   </w:style>
   <w:style w:type="character" w:customStyle="1" w:styleId="NormalTok">
     <w:name w:val="NormalTok"/>
     <w:basedOn w:val="VerbatimChar"/>
-    <w:rPr/>
+    <w:rPr>
+      <w:color w:val="003b4f"/>
+      <w:shd w:val="clear" w:fill="f1f3f5"/>
+    </w:rPr>
   </w:style>
 </w:styles>
 </file>

</xml_diff>